<commit_message>
Reprint week 1–9 Classroom packs with räknerutor.
</commit_message>
<xml_diff>
--- a/kurs/classroom-pack/vecka-01/elev-stotvag.docx
+++ b/kurs/classroom-pack/vecka-01/elev-stotvag.docx
@@ -870,6 +870,115 @@
           <w:color w:val="111111"/>
           <w:sz w:val="26"/>
         </w:rPr>
+        <w:t>Räkna</w:t>
+      </w:r>
+    </w:p>
+    <w:p>
+      <w:pPr>
+        <w:spacing w:before="0" w:after="120" w:line="276" w:lineRule="auto"/>
+      </w:pPr>
+      <w:r>
+        <w:rPr>
+          <w:rFonts w:ascii="IBM Plex Sans" w:hAnsi="IBM Plex Sans" w:eastAsia="IBM Plex Sans" w:cs="IBM Plex Sans"/>
+          <w:b w:val="0"/>
+          <w:color w:val="111111"/>
+          <w:sz w:val="21"/>
+        </w:rPr>
+        <w:t xml:space="preserve">Fatima. Våt väg </w:t>
+      </w:r>
+      <w:r>
+        <w:rPr>
+          <w:rFonts w:ascii="IBM Plex Sans" w:hAnsi="IBM Plex Sans" w:eastAsia="IBM Plex Sans" w:cs="IBM Plex Sans"/>
+          <w:b/>
+          <w:color w:val="111111"/>
+          <w:sz w:val="21"/>
+        </w:rPr>
+        <w:t>1 kΩ</w:t>
+      </w:r>
+      <w:r>
+        <w:rPr>
+          <w:rFonts w:ascii="IBM Plex Sans" w:hAnsi="IBM Plex Sans" w:eastAsia="IBM Plex Sans" w:cs="IBM Plex Sans"/>
+          <w:b w:val="0"/>
+          <w:color w:val="111111"/>
+          <w:sz w:val="21"/>
+        </w:rPr>
+        <w:t xml:space="preserve">. Skåp </w:t>
+      </w:r>
+      <w:r>
+        <w:rPr>
+          <w:rFonts w:ascii="IBM Plex Sans" w:hAnsi="IBM Plex Sans" w:eastAsia="IBM Plex Sans" w:cs="IBM Plex Sans"/>
+          <w:b/>
+          <w:color w:val="111111"/>
+          <w:sz w:val="21"/>
+        </w:rPr>
+        <w:t>230 V</w:t>
+      </w:r>
+      <w:r>
+        <w:rPr>
+          <w:rFonts w:ascii="IBM Plex Sans" w:hAnsi="IBM Plex Sans" w:eastAsia="IBM Plex Sans" w:cs="IBM Plex Sans"/>
+          <w:b w:val="0"/>
+          <w:color w:val="111111"/>
+          <w:sz w:val="21"/>
+        </w:rPr>
+        <w:t>. På papper. Inte kroppstabell.</w:t>
+      </w:r>
+    </w:p>
+    <w:p>
+      <w:pPr>
+        <w:spacing w:before="0" w:after="120" w:line="276" w:lineRule="auto"/>
+      </w:pPr>
+      <w:r>
+        <w:rPr>
+          <w:rFonts w:ascii="IBM Plex Sans" w:hAnsi="IBM Plex Sans" w:eastAsia="IBM Plex Sans" w:cs="IBM Plex Sans"/>
+          <w:b w:val="0"/>
+          <w:color w:val="111111"/>
+          <w:sz w:val="21"/>
+        </w:rPr>
+        <w:t>I = U / R = ______ A</w:t>
+      </w:r>
+    </w:p>
+    <w:p>
+      <w:pPr>
+        <w:spacing w:before="0" w:after="120" w:line="276" w:lineRule="auto"/>
+      </w:pPr>
+      <w:r>
+        <w:rPr>
+          <w:rFonts w:ascii="IBM Plex Sans" w:hAnsi="IBM Plex Sans" w:eastAsia="IBM Plex Sans" w:cs="IBM Plex Sans"/>
+          <w:b w:val="0"/>
+          <w:color w:val="111111"/>
+          <w:sz w:val="21"/>
+        </w:rPr>
+        <w:t>Elektriker: det är därför STOP innan du tar i.</w:t>
+      </w:r>
+    </w:p>
+    <w:p>
+      <w:pPr>
+        <w:spacing w:before="0" w:after="120" w:line="276" w:lineRule="auto"/>
+      </w:pPr>
+      <w:r>
+        <w:rPr>
+          <w:rFonts w:ascii="IBM Plex Sans" w:hAnsi="IBM Plex Sans" w:eastAsia="IBM Plex Sans" w:cs="IBM Plex Sans"/>
+          <w:b w:val="0"/>
+          <w:color w:val="111111"/>
+          <w:sz w:val="21"/>
+        </w:rPr>
+        <w:t>Ingenjör: räkna I innan handen når höljet.</w:t>
+      </w:r>
+    </w:p>
+    <w:p>
+      <w:pPr>
+        <w:spacing w:before="200" w:after="80"/>
+        <w:pBdr>
+          <w:top w:val="single" w:sz="6" w:space="4" w:color="111111"/>
+        </w:pBdr>
+      </w:pPr>
+      <w:r>
+        <w:rPr>
+          <w:rFonts w:ascii="IBM Plex Sans" w:hAnsi="IBM Plex Sans" w:eastAsia="IBM Plex Sans" w:cs="IBM Plex Sans"/>
+          <w:b/>
+          <w:color w:val="111111"/>
+          <w:sz w:val="26"/>
+        </w:rPr>
         <w:t>4. Två spår — en rad</w:t>
       </w:r>
     </w:p>

</xml_diff>